<commit_message>
docs: header on every page, and the body numbered from one
The cover, team and project sections are front matter and carry no page number; a
real section break at Features restarts the count, so the first feature page is
page 1. The total comes from SECTIONPAGES rather than NUMPAGES — otherwise page one
announces itself as one of nineteen.

Every page now carries both marks, the college and university line, and a rule
under them, so a page pulled out of the middle still says what it belongs to. The
sign-in screenshot was mostly empty dark ground, so it is cropped to the card.
</commit_message>
<xml_diff>
--- a/docs/Islington Hackathon 2026 - The Biggys - Final Submission.docx
+++ b/docs/Islington Hackathon 2026 - The Biggys - Final Submission.docx
@@ -349,6 +349,18 @@
     </w:p>
     <w:p>
       <w:pPr>
+        <w:sectPr>
+          <w:headerReference w:type="default" r:id="rId25"/>
+          <w:footerReference w:type="default" r:id="rId26"/>
+          <w:pgSz w:w="12240" w:h="15840"/>
+          <w:pgMar w:top="1008" w:right="1224" w:bottom="1008" w:left="1224" w:header="720" w:footer="720" w:gutter="0"/>
+          <w:cols w:space="720"/>
+          <w:docGrid w:linePitch="360"/>
+        </w:sectPr>
+      </w:pPr>
+    </w:p>
+    <w:p>
+      <w:pPr>
         <w:pStyle w:val="Heading1"/>
       </w:pPr>
       <w:r>
@@ -371,7 +383,7 @@
       <w:r>
         <w:drawing>
           <wp:inline xmlns:a="http://schemas.openxmlformats.org/drawingml/2006/main" xmlns:pic="http://schemas.openxmlformats.org/drawingml/2006/picture">
-            <wp:extent cx="5440680" cy="3400425"/>
+            <wp:extent cx="4892040" cy="5752498"/>
             <wp:docPr id="2" name="Picture 2"/>
             <wp:cNvGraphicFramePr>
               <a:graphicFrameLocks noChangeAspect="1"/>
@@ -392,7 +404,7 @@
                   <pic:spPr>
                     <a:xfrm>
                       <a:off x="0" y="0"/>
-                      <a:ext cx="5440680" cy="3400425"/>
+                      <a:ext cx="4892040" cy="5752498"/>
                     </a:xfrm>
                     <a:prstGeom prst="rect"/>
                   </pic:spPr>
@@ -441,7 +453,7 @@
       <w:r>
         <w:drawing>
           <wp:inline xmlns:a="http://schemas.openxmlformats.org/drawingml/2006/main" xmlns:pic="http://schemas.openxmlformats.org/drawingml/2006/picture">
-            <wp:extent cx="5440680" cy="3400425"/>
+            <wp:extent cx="4892040" cy="3057525"/>
             <wp:docPr id="3" name="Picture 3"/>
             <wp:cNvGraphicFramePr>
               <a:graphicFrameLocks noChangeAspect="1"/>
@@ -462,7 +474,7 @@
                   <pic:spPr>
                     <a:xfrm>
                       <a:off x="0" y="0"/>
-                      <a:ext cx="5440680" cy="3400425"/>
+                      <a:ext cx="4892040" cy="3057525"/>
                     </a:xfrm>
                     <a:prstGeom prst="rect"/>
                   </pic:spPr>
@@ -511,7 +523,7 @@
       <w:r>
         <w:drawing>
           <wp:inline xmlns:a="http://schemas.openxmlformats.org/drawingml/2006/main" xmlns:pic="http://schemas.openxmlformats.org/drawingml/2006/picture">
-            <wp:extent cx="5440680" cy="3400425"/>
+            <wp:extent cx="4892040" cy="3057525"/>
             <wp:docPr id="4" name="Picture 4"/>
             <wp:cNvGraphicFramePr>
               <a:graphicFrameLocks noChangeAspect="1"/>
@@ -532,7 +544,7 @@
                   <pic:spPr>
                     <a:xfrm>
                       <a:off x="0" y="0"/>
-                      <a:ext cx="5440680" cy="3400425"/>
+                      <a:ext cx="4892040" cy="3057525"/>
                     </a:xfrm>
                     <a:prstGeom prst="rect"/>
                   </pic:spPr>
@@ -581,7 +593,7 @@
       <w:r>
         <w:drawing>
           <wp:inline xmlns:a="http://schemas.openxmlformats.org/drawingml/2006/main" xmlns:pic="http://schemas.openxmlformats.org/drawingml/2006/picture">
-            <wp:extent cx="5440680" cy="3400425"/>
+            <wp:extent cx="4892040" cy="3057525"/>
             <wp:docPr id="5" name="Picture 5"/>
             <wp:cNvGraphicFramePr>
               <a:graphicFrameLocks noChangeAspect="1"/>
@@ -602,7 +614,7 @@
                   <pic:spPr>
                     <a:xfrm>
                       <a:off x="0" y="0"/>
-                      <a:ext cx="5440680" cy="3400425"/>
+                      <a:ext cx="4892040" cy="3057525"/>
                     </a:xfrm>
                     <a:prstGeom prst="rect"/>
                   </pic:spPr>
@@ -651,7 +663,7 @@
       <w:r>
         <w:drawing>
           <wp:inline xmlns:a="http://schemas.openxmlformats.org/drawingml/2006/main" xmlns:pic="http://schemas.openxmlformats.org/drawingml/2006/picture">
-            <wp:extent cx="5440680" cy="3400425"/>
+            <wp:extent cx="4892040" cy="3057525"/>
             <wp:docPr id="6" name="Picture 6"/>
             <wp:cNvGraphicFramePr>
               <a:graphicFrameLocks noChangeAspect="1"/>
@@ -672,7 +684,7 @@
                   <pic:spPr>
                     <a:xfrm>
                       <a:off x="0" y="0"/>
-                      <a:ext cx="5440680" cy="3400425"/>
+                      <a:ext cx="4892040" cy="3057525"/>
                     </a:xfrm>
                     <a:prstGeom prst="rect"/>
                   </pic:spPr>
@@ -721,7 +733,7 @@
       <w:r>
         <w:drawing>
           <wp:inline xmlns:a="http://schemas.openxmlformats.org/drawingml/2006/main" xmlns:pic="http://schemas.openxmlformats.org/drawingml/2006/picture">
-            <wp:extent cx="5440680" cy="3400425"/>
+            <wp:extent cx="4892040" cy="3057525"/>
             <wp:docPr id="7" name="Picture 7"/>
             <wp:cNvGraphicFramePr>
               <a:graphicFrameLocks noChangeAspect="1"/>
@@ -742,7 +754,7 @@
                   <pic:spPr>
                     <a:xfrm>
                       <a:off x="0" y="0"/>
-                      <a:ext cx="5440680" cy="3400425"/>
+                      <a:ext cx="4892040" cy="3057525"/>
                     </a:xfrm>
                     <a:prstGeom prst="rect"/>
                   </pic:spPr>
@@ -791,7 +803,7 @@
       <w:r>
         <w:drawing>
           <wp:inline xmlns:a="http://schemas.openxmlformats.org/drawingml/2006/main" xmlns:pic="http://schemas.openxmlformats.org/drawingml/2006/picture">
-            <wp:extent cx="5440680" cy="3400425"/>
+            <wp:extent cx="4892040" cy="3057525"/>
             <wp:docPr id="8" name="Picture 8"/>
             <wp:cNvGraphicFramePr>
               <a:graphicFrameLocks noChangeAspect="1"/>
@@ -812,7 +824,7 @@
                   <pic:spPr>
                     <a:xfrm>
                       <a:off x="0" y="0"/>
-                      <a:ext cx="5440680" cy="3400425"/>
+                      <a:ext cx="4892040" cy="3057525"/>
                     </a:xfrm>
                     <a:prstGeom prst="rect"/>
                   </pic:spPr>
@@ -861,7 +873,7 @@
       <w:r>
         <w:drawing>
           <wp:inline xmlns:a="http://schemas.openxmlformats.org/drawingml/2006/main" xmlns:pic="http://schemas.openxmlformats.org/drawingml/2006/picture">
-            <wp:extent cx="5440680" cy="3400425"/>
+            <wp:extent cx="4892040" cy="3057525"/>
             <wp:docPr id="9" name="Picture 9"/>
             <wp:cNvGraphicFramePr>
               <a:graphicFrameLocks noChangeAspect="1"/>
@@ -882,7 +894,7 @@
                   <pic:spPr>
                     <a:xfrm>
                       <a:off x="0" y="0"/>
-                      <a:ext cx="5440680" cy="3400425"/>
+                      <a:ext cx="4892040" cy="3057525"/>
                     </a:xfrm>
                     <a:prstGeom prst="rect"/>
                   </pic:spPr>
@@ -931,7 +943,7 @@
       <w:r>
         <w:drawing>
           <wp:inline xmlns:a="http://schemas.openxmlformats.org/drawingml/2006/main" xmlns:pic="http://schemas.openxmlformats.org/drawingml/2006/picture">
-            <wp:extent cx="5440680" cy="3400425"/>
+            <wp:extent cx="4892040" cy="3057525"/>
             <wp:docPr id="10" name="Picture 10"/>
             <wp:cNvGraphicFramePr>
               <a:graphicFrameLocks noChangeAspect="1"/>
@@ -952,7 +964,7 @@
                   <pic:spPr>
                     <a:xfrm>
                       <a:off x="0" y="0"/>
-                      <a:ext cx="5440680" cy="3400425"/>
+                      <a:ext cx="4892040" cy="3057525"/>
                     </a:xfrm>
                     <a:prstGeom prst="rect"/>
                   </pic:spPr>
@@ -1001,7 +1013,7 @@
       <w:r>
         <w:drawing>
           <wp:inline xmlns:a="http://schemas.openxmlformats.org/drawingml/2006/main" xmlns:pic="http://schemas.openxmlformats.org/drawingml/2006/picture">
-            <wp:extent cx="5440680" cy="3400425"/>
+            <wp:extent cx="4892040" cy="3057525"/>
             <wp:docPr id="11" name="Picture 11"/>
             <wp:cNvGraphicFramePr>
               <a:graphicFrameLocks noChangeAspect="1"/>
@@ -1022,7 +1034,7 @@
                   <pic:spPr>
                     <a:xfrm>
                       <a:off x="0" y="0"/>
-                      <a:ext cx="5440680" cy="3400425"/>
+                      <a:ext cx="4892040" cy="3057525"/>
                     </a:xfrm>
                     <a:prstGeom prst="rect"/>
                   </pic:spPr>
@@ -1071,7 +1083,7 @@
       <w:r>
         <w:drawing>
           <wp:inline xmlns:a="http://schemas.openxmlformats.org/drawingml/2006/main" xmlns:pic="http://schemas.openxmlformats.org/drawingml/2006/picture">
-            <wp:extent cx="5440680" cy="3400425"/>
+            <wp:extent cx="4892040" cy="3057525"/>
             <wp:docPr id="12" name="Picture 12"/>
             <wp:cNvGraphicFramePr>
               <a:graphicFrameLocks noChangeAspect="1"/>
@@ -1092,7 +1104,7 @@
                   <pic:spPr>
                     <a:xfrm>
                       <a:off x="0" y="0"/>
-                      <a:ext cx="5440680" cy="3400425"/>
+                      <a:ext cx="4892040" cy="3057525"/>
                     </a:xfrm>
                     <a:prstGeom prst="rect"/>
                   </pic:spPr>
@@ -1141,7 +1153,7 @@
       <w:r>
         <w:drawing>
           <wp:inline xmlns:a="http://schemas.openxmlformats.org/drawingml/2006/main" xmlns:pic="http://schemas.openxmlformats.org/drawingml/2006/picture">
-            <wp:extent cx="5440680" cy="3400425"/>
+            <wp:extent cx="4892040" cy="3057525"/>
             <wp:docPr id="13" name="Picture 13"/>
             <wp:cNvGraphicFramePr>
               <a:graphicFrameLocks noChangeAspect="1"/>
@@ -1162,7 +1174,7 @@
                   <pic:spPr>
                     <a:xfrm>
                       <a:off x="0" y="0"/>
-                      <a:ext cx="5440680" cy="3400425"/>
+                      <a:ext cx="4892040" cy="3057525"/>
                     </a:xfrm>
                     <a:prstGeom prst="rect"/>
                   </pic:spPr>
@@ -1341,7 +1353,7 @@
       <w:r>
         <w:drawing>
           <wp:inline xmlns:a="http://schemas.openxmlformats.org/drawingml/2006/main" xmlns:pic="http://schemas.openxmlformats.org/drawingml/2006/picture">
-            <wp:extent cx="5440680" cy="3400425"/>
+            <wp:extent cx="4892040" cy="3057525"/>
             <wp:docPr id="16" name="Picture 16"/>
             <wp:cNvGraphicFramePr>
               <a:graphicFrameLocks noChangeAspect="1"/>
@@ -1362,7 +1374,7 @@
                   <pic:spPr>
                     <a:xfrm>
                       <a:off x="0" y="0"/>
-                      <a:ext cx="5440680" cy="3400425"/>
+                      <a:ext cx="4892040" cy="3057525"/>
                     </a:xfrm>
                     <a:prstGeom prst="rect"/>
                   </pic:spPr>
@@ -2025,13 +2037,330 @@
       </w:r>
     </w:p>
     <w:sectPr>
+      <w:headerReference w:type="default" r:id="rId27"/>
+      <w:footerReference w:type="default" r:id="rId28"/>
       <w:pgSz w:w="12240" w:h="15840"/>
-      <w:pgMar w:top="1008" w:right="1224" w:bottom="1008" w:left="1224" w:header="720" w:footer="720" w:gutter="0"/>
+      <w:pgMar w:top="1181" w:right="1224" w:bottom="1008" w:left="1224" w:header="720" w:footer="720" w:gutter="0"/>
       <w:cols w:space="720"/>
       <w:docGrid w:linePitch="360"/>
+      <w:pgNumType w:start="1"/>
     </w:sectPr>
   </w:body>
 </w:document>
+</file>
+
+<file path=word/footer1.xml><?xml version="1.0" encoding="utf-8"?>
+<w:ftr xmlns:m="http://schemas.openxmlformats.org/officeDocument/2006/math" xmlns:mc="http://schemas.openxmlformats.org/markup-compatibility/2006" xmlns:mo="http://schemas.microsoft.com/office/mac/office/2008/main" xmlns:mv="urn:schemas-microsoft-com:mac:vml" xmlns:o="urn:schemas-microsoft-com:office:office" xmlns:r="http://schemas.openxmlformats.org/officeDocument/2006/relationships" xmlns:v="urn:schemas-microsoft-com:vml" xmlns:w10="urn:schemas-microsoft-com:office:word" xmlns:w14="http://schemas.microsoft.com/office/word/2010/wordml" xmlns:w="http://schemas.openxmlformats.org/wordprocessingml/2006/main" xmlns:wne="http://schemas.microsoft.com/office/word/2006/wordml" xmlns:wp14="http://schemas.microsoft.com/office/word/2010/wordprocessingDrawing" xmlns:wp="http://schemas.openxmlformats.org/drawingml/2006/wordprocessingDrawing" xmlns:wpc="http://schemas.microsoft.com/office/word/2010/wordprocessingCanvas" xmlns:wpg="http://schemas.microsoft.com/office/word/2010/wordprocessingGroup" xmlns:wpi="http://schemas.microsoft.com/office/word/2010/wordprocessingInk" xmlns:wps="http://schemas.microsoft.com/office/word/2010/wordprocessingShape" mc:Ignorable="w14 wp14">
+  <w:p/>
+</w:ftr>
+</file>
+
+<file path=word/footer2.xml><?xml version="1.0" encoding="utf-8"?>
+<w:ftr xmlns:m="http://schemas.openxmlformats.org/officeDocument/2006/math" xmlns:mc="http://schemas.openxmlformats.org/markup-compatibility/2006" xmlns:mo="http://schemas.microsoft.com/office/mac/office/2008/main" xmlns:mv="urn:schemas-microsoft-com:mac:vml" xmlns:o="urn:schemas-microsoft-com:office:office" xmlns:r="http://schemas.openxmlformats.org/officeDocument/2006/relationships" xmlns:v="urn:schemas-microsoft-com:vml" xmlns:w10="urn:schemas-microsoft-com:office:word" xmlns:w14="http://schemas.microsoft.com/office/word/2010/wordml" xmlns:w="http://schemas.openxmlformats.org/wordprocessingml/2006/main" xmlns:wne="http://schemas.microsoft.com/office/word/2006/wordml" xmlns:wp14="http://schemas.microsoft.com/office/word/2010/wordprocessingDrawing" xmlns:wp="http://schemas.openxmlformats.org/drawingml/2006/wordprocessingDrawing" xmlns:wpc="http://schemas.microsoft.com/office/word/2010/wordprocessingCanvas" xmlns:wpg="http://schemas.microsoft.com/office/word/2010/wordprocessingGroup" xmlns:wpi="http://schemas.microsoft.com/office/word/2010/wordprocessingInk" xmlns:wps="http://schemas.microsoft.com/office/word/2010/wordprocessingShape" mc:Ignorable="w14 wp14">
+  <w:p>
+    <w:pPr>
+      <w:jc w:val="center"/>
+    </w:pPr>
+    <w:r>
+      <w:rPr>
+        <w:color w:val="555566"/>
+        <w:sz w:val="16"/>
+      </w:rPr>
+      <w:t xml:space="preserve">Page </w:t>
+    </w:r>
+    <w:r>
+      <w:rPr>
+        <w:color w:val="555566"/>
+        <w:sz w:val="16"/>
+      </w:rPr>
+      <w:fldChar w:fldCharType="begin"/>
+      <w:instrText xml:space="preserve"> PAGE </w:instrText>
+      <w:fldChar w:fldCharType="end"/>
+    </w:r>
+    <w:r>
+      <w:rPr>
+        <w:color w:val="555566"/>
+        <w:sz w:val="16"/>
+      </w:rPr>
+      <w:t xml:space="preserve"> of </w:t>
+    </w:r>
+    <w:r>
+      <w:rPr>
+        <w:color w:val="555566"/>
+        <w:sz w:val="16"/>
+      </w:rPr>
+      <w:fldChar w:fldCharType="begin"/>
+      <w:instrText xml:space="preserve"> SECTIONPAGES </w:instrText>
+      <w:fldChar w:fldCharType="end"/>
+    </w:r>
+  </w:p>
+</w:ftr>
+</file>
+
+<file path=word/header1.xml><?xml version="1.0" encoding="utf-8"?>
+<w:hdr xmlns:m="http://schemas.openxmlformats.org/officeDocument/2006/math" xmlns:mc="http://schemas.openxmlformats.org/markup-compatibility/2006" xmlns:mo="http://schemas.microsoft.com/office/mac/office/2008/main" xmlns:mv="urn:schemas-microsoft-com:mac:vml" xmlns:o="urn:schemas-microsoft-com:office:office" xmlns:r="http://schemas.openxmlformats.org/officeDocument/2006/relationships" xmlns:v="urn:schemas-microsoft-com:vml" xmlns:w10="urn:schemas-microsoft-com:office:word" xmlns:w14="http://schemas.microsoft.com/office/word/2010/wordml" xmlns:w="http://schemas.openxmlformats.org/wordprocessingml/2006/main" xmlns:wne="http://schemas.microsoft.com/office/word/2006/wordml" xmlns:wp14="http://schemas.microsoft.com/office/word/2010/wordprocessingDrawing" xmlns:wp="http://schemas.openxmlformats.org/drawingml/2006/wordprocessingDrawing" xmlns:wpc="http://schemas.microsoft.com/office/word/2010/wordprocessingCanvas" xmlns:wpg="http://schemas.microsoft.com/office/word/2010/wordprocessingGroup" xmlns:wpi="http://schemas.microsoft.com/office/word/2010/wordprocessingInk" xmlns:wps="http://schemas.microsoft.com/office/word/2010/wordprocessingShape" mc:Ignorable="w14 wp14">
+  <w:tbl>
+    <w:tblPr>
+      <w:tblW w:type="auto" w:w="0"/>
+      <w:tblLayout w:type="fixed"/>
+      <w:tblLook w:firstColumn="1" w:firstRow="1" w:lastColumn="0" w:lastRow="0" w:noHBand="0" w:noVBand="1" w:val="04A0"/>
+    </w:tblPr>
+    <w:tblGrid>
+      <w:gridCol w:w="4896"/>
+      <w:gridCol w:w="4896"/>
+    </w:tblGrid>
+    <w:tr>
+      <w:tc>
+        <w:tcPr>
+          <w:tcW w:type="dxa" w:w="5040"/>
+        </w:tcPr>
+        <w:p>
+          <w:pPr>
+            <w:jc w:val="left"/>
+          </w:pPr>
+          <w:r>
+            <w:drawing>
+              <wp:inline xmlns:a="http://schemas.openxmlformats.org/drawingml/2006/main" xmlns:pic="http://schemas.openxmlformats.org/drawingml/2006/picture">
+                <wp:extent cx="325117" cy="310896"/>
+                <wp:docPr id="1" name="Picture 1"/>
+                <wp:cNvGraphicFramePr>
+                  <a:graphicFrameLocks noChangeAspect="1"/>
+                </wp:cNvGraphicFramePr>
+                <a:graphic>
+                  <a:graphicData uri="http://schemas.openxmlformats.org/drawingml/2006/picture">
+                    <pic:pic>
+                      <pic:nvPicPr>
+                        <pic:cNvPr id="0" name="logo.png"/>
+                        <pic:cNvPicPr/>
+                      </pic:nvPicPr>
+                      <pic:blipFill>
+                        <a:blip r:embed="rId1"/>
+                        <a:stretch>
+                          <a:fillRect/>
+                        </a:stretch>
+                      </pic:blipFill>
+                      <pic:spPr>
+                        <a:xfrm>
+                          <a:off x="0" y="0"/>
+                          <a:ext cx="325117" cy="310896"/>
+                        </a:xfrm>
+                        <a:prstGeom prst="rect"/>
+                      </pic:spPr>
+                    </pic:pic>
+                  </a:graphicData>
+                </a:graphic>
+              </wp:inline>
+            </w:drawing>
+          </w:r>
+          <w:r>
+            <w:t xml:space="preserve">   </w:t>
+          </w:r>
+          <w:r>
+            <w:drawing>
+              <wp:inline xmlns:a="http://schemas.openxmlformats.org/drawingml/2006/main" xmlns:pic="http://schemas.openxmlformats.org/drawingml/2006/picture">
+                <wp:extent cx="1011677" cy="237744"/>
+                <wp:docPr id="2" name="Picture 2"/>
+                <wp:cNvGraphicFramePr>
+                  <a:graphicFrameLocks noChangeAspect="1"/>
+                </wp:cNvGraphicFramePr>
+                <a:graphic>
+                  <a:graphicData uri="http://schemas.openxmlformats.org/drawingml/2006/picture">
+                    <pic:pic>
+                      <pic:nvPicPr>
+                        <pic:cNvPr id="0" name="islington.png"/>
+                        <pic:cNvPicPr/>
+                      </pic:nvPicPr>
+                      <pic:blipFill>
+                        <a:blip r:embed="rId2"/>
+                        <a:stretch>
+                          <a:fillRect/>
+                        </a:stretch>
+                      </pic:blipFill>
+                      <pic:spPr>
+                        <a:xfrm>
+                          <a:off x="0" y="0"/>
+                          <a:ext cx="1011677" cy="237744"/>
+                        </a:xfrm>
+                        <a:prstGeom prst="rect"/>
+                      </pic:spPr>
+                    </pic:pic>
+                  </a:graphicData>
+                </a:graphic>
+              </wp:inline>
+            </w:drawing>
+          </w:r>
+        </w:p>
+      </w:tc>
+      <w:tc>
+        <w:tcPr>
+          <w:tcW w:type="dxa" w:w="4752"/>
+        </w:tcPr>
+        <w:p>
+          <w:pPr>
+            <w:jc w:val="right"/>
+          </w:pPr>
+          <w:r>
+            <w:rPr>
+              <w:b/>
+              <w:color w:val="1E1B4B"/>
+              <w:sz w:val="15"/>
+            </w:rPr>
+            <w:t>Islington College · London Metropolitan University</w:t>
+            <w:br/>
+          </w:r>
+          <w:r>
+            <w:rPr>
+              <w:color w:val="555566"/>
+              <w:sz w:val="14"/>
+            </w:rPr>
+            <w:t>KramIQ · RTE Integrated Management System · The Biggys</w:t>
+          </w:r>
+        </w:p>
+      </w:tc>
+    </w:tr>
+  </w:tbl>
+  <w:p>
+    <w:pPr>
+      <w:spacing w:before="0" w:after="40"/>
+      <w:pBdr>
+        <w:bottom w:val="single" w:sz="6" w:space="4" w:color="1E1B4B"/>
+      </w:pBdr>
+    </w:pPr>
+  </w:p>
+</w:hdr>
+</file>
+
+<file path=word/header2.xml><?xml version="1.0" encoding="utf-8"?>
+<w:hdr xmlns:m="http://schemas.openxmlformats.org/officeDocument/2006/math" xmlns:mc="http://schemas.openxmlformats.org/markup-compatibility/2006" xmlns:mo="http://schemas.microsoft.com/office/mac/office/2008/main" xmlns:mv="urn:schemas-microsoft-com:mac:vml" xmlns:o="urn:schemas-microsoft-com:office:office" xmlns:r="http://schemas.openxmlformats.org/officeDocument/2006/relationships" xmlns:v="urn:schemas-microsoft-com:vml" xmlns:w10="urn:schemas-microsoft-com:office:word" xmlns:w14="http://schemas.microsoft.com/office/word/2010/wordml" xmlns:w="http://schemas.openxmlformats.org/wordprocessingml/2006/main" xmlns:wne="http://schemas.microsoft.com/office/word/2006/wordml" xmlns:wp14="http://schemas.microsoft.com/office/word/2010/wordprocessingDrawing" xmlns:wp="http://schemas.openxmlformats.org/drawingml/2006/wordprocessingDrawing" xmlns:wpc="http://schemas.microsoft.com/office/word/2010/wordprocessingCanvas" xmlns:wpg="http://schemas.microsoft.com/office/word/2010/wordprocessingGroup" xmlns:wpi="http://schemas.microsoft.com/office/word/2010/wordprocessingInk" xmlns:wps="http://schemas.microsoft.com/office/word/2010/wordprocessingShape" mc:Ignorable="w14 wp14">
+  <w:tbl>
+    <w:tblPr>
+      <w:tblW w:type="auto" w:w="0"/>
+      <w:tblLayout w:type="fixed"/>
+      <w:tblLook w:firstColumn="1" w:firstRow="1" w:lastColumn="0" w:lastRow="0" w:noHBand="0" w:noVBand="1" w:val="04A0"/>
+    </w:tblPr>
+    <w:tblGrid>
+      <w:gridCol w:w="4896"/>
+      <w:gridCol w:w="4896"/>
+    </w:tblGrid>
+    <w:tr>
+      <w:tc>
+        <w:tcPr>
+          <w:tcW w:type="dxa" w:w="5040"/>
+        </w:tcPr>
+        <w:p>
+          <w:pPr>
+            <w:jc w:val="left"/>
+          </w:pPr>
+          <w:r>
+            <w:drawing>
+              <wp:inline xmlns:a="http://schemas.openxmlformats.org/drawingml/2006/main" xmlns:pic="http://schemas.openxmlformats.org/drawingml/2006/picture">
+                <wp:extent cx="325117" cy="310896"/>
+                <wp:docPr id="1" name="Picture 1"/>
+                <wp:cNvGraphicFramePr>
+                  <a:graphicFrameLocks noChangeAspect="1"/>
+                </wp:cNvGraphicFramePr>
+                <a:graphic>
+                  <a:graphicData uri="http://schemas.openxmlformats.org/drawingml/2006/picture">
+                    <pic:pic>
+                      <pic:nvPicPr>
+                        <pic:cNvPr id="0" name="logo.png"/>
+                        <pic:cNvPicPr/>
+                      </pic:nvPicPr>
+                      <pic:blipFill>
+                        <a:blip r:embed="rId1"/>
+                        <a:stretch>
+                          <a:fillRect/>
+                        </a:stretch>
+                      </pic:blipFill>
+                      <pic:spPr>
+                        <a:xfrm>
+                          <a:off x="0" y="0"/>
+                          <a:ext cx="325117" cy="310896"/>
+                        </a:xfrm>
+                        <a:prstGeom prst="rect"/>
+                      </pic:spPr>
+                    </pic:pic>
+                  </a:graphicData>
+                </a:graphic>
+              </wp:inline>
+            </w:drawing>
+          </w:r>
+          <w:r>
+            <w:t xml:space="preserve">   </w:t>
+          </w:r>
+          <w:r>
+            <w:drawing>
+              <wp:inline xmlns:a="http://schemas.openxmlformats.org/drawingml/2006/main" xmlns:pic="http://schemas.openxmlformats.org/drawingml/2006/picture">
+                <wp:extent cx="1011677" cy="237744"/>
+                <wp:docPr id="2" name="Picture 2"/>
+                <wp:cNvGraphicFramePr>
+                  <a:graphicFrameLocks noChangeAspect="1"/>
+                </wp:cNvGraphicFramePr>
+                <a:graphic>
+                  <a:graphicData uri="http://schemas.openxmlformats.org/drawingml/2006/picture">
+                    <pic:pic>
+                      <pic:nvPicPr>
+                        <pic:cNvPr id="0" name="islington.png"/>
+                        <pic:cNvPicPr/>
+                      </pic:nvPicPr>
+                      <pic:blipFill>
+                        <a:blip r:embed="rId2"/>
+                        <a:stretch>
+                          <a:fillRect/>
+                        </a:stretch>
+                      </pic:blipFill>
+                      <pic:spPr>
+                        <a:xfrm>
+                          <a:off x="0" y="0"/>
+                          <a:ext cx="1011677" cy="237744"/>
+                        </a:xfrm>
+                        <a:prstGeom prst="rect"/>
+                      </pic:spPr>
+                    </pic:pic>
+                  </a:graphicData>
+                </a:graphic>
+              </wp:inline>
+            </w:drawing>
+          </w:r>
+        </w:p>
+      </w:tc>
+      <w:tc>
+        <w:tcPr>
+          <w:tcW w:type="dxa" w:w="4752"/>
+        </w:tcPr>
+        <w:p>
+          <w:pPr>
+            <w:jc w:val="right"/>
+          </w:pPr>
+          <w:r>
+            <w:rPr>
+              <w:b/>
+              <w:color w:val="1E1B4B"/>
+              <w:sz w:val="15"/>
+            </w:rPr>
+            <w:t>Islington College · London Metropolitan University</w:t>
+            <w:br/>
+          </w:r>
+          <w:r>
+            <w:rPr>
+              <w:color w:val="555566"/>
+              <w:sz w:val="14"/>
+            </w:rPr>
+            <w:t>KramIQ · RTE Integrated Management System · The Biggys</w:t>
+          </w:r>
+        </w:p>
+      </w:tc>
+    </w:tr>
+  </w:tbl>
+  <w:p>
+    <w:pPr>
+      <w:spacing w:before="0" w:after="40"/>
+      <w:pBdr>
+        <w:bottom w:val="single" w:sz="6" w:space="4" w:color="1E1B4B"/>
+      </w:pBdr>
+    </w:pPr>
+  </w:p>
+</w:hdr>
 </file>
 
 <file path=word/numbering.xml><?xml version="1.0" encoding="utf-8"?>

</xml_diff>